<commit_message>
Add files via upload Co-authored-by: surfatheart <22271710+surfatheart@users.noreply.github.com>
</commit_message>
<xml_diff>
--- a/安大略省中医Doctor头衔制度_修订版(1)0526.docx
+++ b/安大略省中医Doctor头衔制度_修订版(1)0526.docx
@@ -337,13 +337,7 @@
         <w:rPr>
           <w:color w:val="auto"/>
         </w:rPr>
-        <w:t>医疗职业普遍采取受监管职业的治理模式，通过立法明确执业资格、职业责任及监管机构的权力范围，职业头衔在此框架中兼具专业身份标示与公共安全保障的制度功能。</w:t>
-      </w:r>
-      <w:r>
-        <w:rPr>
-          <w:color w:val="auto"/>
-        </w:rPr>
-        <w:t>阿尔伯塔省于1988年率先通过针灸立法</w:t>
+        <w:t>医疗职业普遍采取受监管职业的治理模式，通过立法明确执业资格、职业责任及监管机构的权力范围，职业头衔在此框架中兼具专业身份标示与公共安全保障的制度功能。阿尔伯塔省于1988年率先通过针灸立法</w:t>
       </w:r>
       <w:r>
         <w:rPr>
@@ -1458,15 +1452,7 @@
         <w:rPr>
           <w:color w:val="auto"/>
         </w:rPr>
-        <w:t>获授更高层级头衔的执业者，其临床决策能力、诊疗范围及专业行为均须承担相应程度的法律与伦理责任，因此Doctor头衔制度不仅是</w:t>
-      </w:r>
-      <w:bookmarkStart w:id="0" w:name="_GoBack"/>
-      <w:bookmarkEnd w:id="0"/>
-      <w:r>
-        <w:rPr>
-          <w:color w:val="auto"/>
-        </w:rPr>
-        <w:t>身份标识机制，同时也是医疗责任分配的重要制度安排。从更宏观的政策视角看，安大略省多个医疗职业均以Doctor作为高层级临床称谓，中医职业若欲在医疗体系中建立对应的制度地位，确立类似的头衔制度是职业制度发展的必要环节。</w:t>
+        <w:t>获授更高层级头衔的执业者，其临床决策能力、诊疗范围及专业行为均须承担相应程度的法律与伦理责任，因此Doctor头衔制度不仅是身份标识机制，同时也是医疗责任分配的重要制度安排。从更宏观的政策视角看，安大略省多个医疗职业均以Doctor作为高层级临床称谓，中医职业若欲在医疗体系中建立对应的制度地位，确立类似的头衔制度是职业制度发展的必要环节。</w:t>
       </w:r>
     </w:p>
     <w:p>
@@ -3406,29 +3392,47 @@
         <w:rPr>
           <w:color w:val="auto"/>
         </w:rPr>
-        <w:t>从国际比较角度看，安大略省所建立的Doctor头衔制度为传统医学职业监管提供了一种具有参考价值的制度模式。在全球范围内，多数传统医学体系在制度化过程中面临类似问题，即如何在维持传统医学理论特色的同时，建立符合现代医疗监管要求的职业制度。安大略模式通过法律监管、能力框架与教育制度之间的有机衔接，为中医职业体系逐步形成现代医疗职业特征的监管结构提供了制度参照。</w:t>
-      </w:r>
-    </w:p>
-    <w:p>
-      <w:pPr>
-        <w:spacing w:after="80"/>
-        <w:rPr>
-          <w:color w:val="auto"/>
-        </w:rPr>
-      </w:pPr>
-    </w:p>
-    <w:p>
-      <w:pPr>
-        <w:pStyle w:val="2"/>
-        <w:rPr>
-          <w:color w:val="auto"/>
-        </w:rPr>
-      </w:pPr>
-      <w:r>
-        <w:rPr>
-          <w:color w:val="auto"/>
-        </w:rPr>
-        <w:t>8 结论</w:t>
+        <w:t>美国采取州级分散监管路径，47个州及哥伦比亚特区已通过针灸或东方医学执业立法，联邦层面则无统一的中医职业法规；针灸与东方医学认证委员会（ACAHM）认证课程与全国针灸与东方医学认证委员会（NCCAOM）资格考试构成事实上的全国标准</w:t>
+      </w:r>
+      <w:r>
+        <w:rPr>
+          <w:color w:val="auto"/>
+          <w:vertAlign w:val="superscript"/>
+        </w:rPr>
+        <w:t>[12-13]</w:t>
+      </w:r>
+      <w:r>
+        <w:rPr>
+          <w:color w:val="auto"/>
+        </w:rPr>
+        <w:t>。Doctor头衔在各州的使用差异显著</w:t>
+      </w:r>
+      <w:r>
+        <w:rPr>
+          <w:rFonts w:hint="eastAsia"/>
+          <w:color w:val="auto"/>
+          <w:lang w:eastAsia="zh-CN"/>
+        </w:rPr>
+        <w:t>，</w:t>
+      </w:r>
+      <w:r>
+        <w:rPr>
+          <w:color w:val="auto"/>
+        </w:rPr>
+        <w:t>部分州规定仅持有第一执业博士学位（DAcCHM/DAOM）且取得本州执照者方可使用Doctor of Acupuncture称谓，另一些州则无此限制；各州针灸培训学时下限亦差异明显，约介于1300至4000学时之间，致使头衔作为能力信号的稳定性受到一定削弱</w:t>
+      </w:r>
+      <w:r>
+        <w:rPr>
+          <w:color w:val="auto"/>
+          <w:vertAlign w:val="superscript"/>
+        </w:rPr>
+        <w:t>[14]</w:t>
+      </w:r>
+      <w:r>
+        <w:rPr>
+          <w:color w:val="auto"/>
+        </w:rPr>
+        <w:t>。</w:t>
       </w:r>
     </w:p>
     <w:p>
@@ -3444,7 +3448,104 @@
         <w:rPr>
           <w:color w:val="auto"/>
         </w:rPr>
-        <w:t>安大略省中医Doctor头衔制度的建立，标志着中医职业制度发展进入新的阶段。在既有监管框架下，通过能力标准、教育要求与临床评估制度之间的系统衔接，中医职业逐步形成具有层级结构的专业体系。Doctor头衔在此结构中承担识别高层级临床能力的制度功能，使职业内部的专业分工与能力差异得以在法律与监管层面获得明确表达。</w:t>
+        <w:t>澳大利亚</w:t>
+      </w:r>
+      <w:r>
+        <w:rPr>
+          <w:rFonts w:hint="eastAsia"/>
+          <w:color w:val="auto"/>
+          <w:lang w:val="en-US" w:eastAsia="zh-CN"/>
+        </w:rPr>
+        <w:t>则是</w:t>
+      </w:r>
+      <w:r>
+        <w:rPr>
+          <w:color w:val="auto"/>
+        </w:rPr>
+        <w:t>由澳大利亚卫生从业者监管局（AHPRA）下设的中医管理委员会（CMBA）负责全国范围的中医注册管理，对</w:t>
+      </w:r>
+      <w:r>
+        <w:rPr>
+          <w:rFonts w:hint="eastAsia"/>
+          <w:color w:val="auto"/>
+          <w:lang w:eastAsia="zh-CN"/>
+        </w:rPr>
+        <w:t>“</w:t>
+      </w:r>
+      <w:r>
+        <w:rPr>
+          <w:color w:val="auto"/>
+        </w:rPr>
+        <w:t>中医师</w:t>
+      </w:r>
+      <w:r>
+        <w:rPr>
+          <w:rFonts w:hint="eastAsia"/>
+          <w:color w:val="auto"/>
+          <w:lang w:eastAsia="zh-CN"/>
+        </w:rPr>
+        <w:t>”“</w:t>
+      </w:r>
+      <w:r>
+        <w:rPr>
+          <w:color w:val="auto"/>
+        </w:rPr>
+        <w:t>中药师</w:t>
+      </w:r>
+      <w:r>
+        <w:rPr>
+          <w:rFonts w:hint="eastAsia"/>
+          <w:color w:val="auto"/>
+          <w:lang w:eastAsia="zh-CN"/>
+        </w:rPr>
+        <w:t>”</w:t>
+      </w:r>
+      <w:r>
+        <w:rPr>
+          <w:color w:val="auto"/>
+        </w:rPr>
+        <w:t>与</w:t>
+      </w:r>
+      <w:r>
+        <w:rPr>
+          <w:rFonts w:hint="eastAsia"/>
+          <w:color w:val="auto"/>
+          <w:lang w:eastAsia="zh-CN"/>
+        </w:rPr>
+        <w:t>“</w:t>
+      </w:r>
+      <w:r>
+        <w:rPr>
+          <w:color w:val="auto"/>
+        </w:rPr>
+        <w:t>针灸师</w:t>
+      </w:r>
+      <w:r>
+        <w:rPr>
+          <w:rFonts w:hint="eastAsia"/>
+          <w:color w:val="auto"/>
+          <w:lang w:eastAsia="zh-CN"/>
+        </w:rPr>
+        <w:t>”</w:t>
+      </w:r>
+      <w:r>
+        <w:rPr>
+          <w:color w:val="auto"/>
+        </w:rPr>
+        <w:t>三类头衔加以法律保护，是西方国家中较早将中医纳入国家级法定监管的代表性辖区</w:t>
+      </w:r>
+      <w:r>
+        <w:rPr>
+          <w:color w:val="auto"/>
+          <w:vertAlign w:val="superscript"/>
+        </w:rPr>
+        <w:t>[6]</w:t>
+      </w:r>
+      <w:r>
+        <w:rPr>
+          <w:color w:val="auto"/>
+        </w:rPr>
+        <w:t>。然而，该制度未引入分层化的Doctor头衔，执业者间的能力差异主要通过临床年资与持续专业发展记录隐性体现，缺乏正式的头衔分级机制。</w:t>
       </w:r>
     </w:p>
     <w:p>
@@ -3460,7 +3561,84 @@
         <w:rPr>
           <w:color w:val="auto"/>
         </w:rPr>
-        <w:t>与既有R.TCMP与R.Ac注册资格相比，Doctor头衔所代表的不仅是执业范围的差异，更涉及临床决策能力与专业责任的制度定位。通过能力框架与资格评估制度的配套设计，Doctor头衔成为监管机构识别高层级临床执业者的重要制度工具——对患者有助于提高专业能力的可辨识性，对监管制度则有助于在职业分层与公共安全保障之间建立更清晰的制度联系。</w:t>
+        <w:t>横向比较可见，三类制度在监管层级与头衔结构上差异显著</w:t>
+      </w:r>
+      <w:r>
+        <w:rPr>
+          <w:rFonts w:hint="eastAsia"/>
+          <w:color w:val="auto"/>
+          <w:lang w:eastAsia="zh-CN"/>
+        </w:rPr>
+        <w:t>。</w:t>
+      </w:r>
+      <w:r>
+        <w:rPr>
+          <w:color w:val="auto"/>
+        </w:rPr>
+        <w:t>美国为州级监管、Doctor头衔局部使用的多元路径；澳大利亚为联邦级统一注册、不设Doctor分层的扁平结构；安大略省则在RHPA框架下，将Doctor头衔同时嵌入跨职业统一监管体系与中医职业内部的分层能力框架，在头衔保护、能力分层与法律责任三者之间建立了较为完整的制度链条</w:t>
+      </w:r>
+      <w:r>
+        <w:rPr>
+          <w:color w:val="auto"/>
+          <w:vertAlign w:val="superscript"/>
+        </w:rPr>
+        <w:t>[15]</w:t>
+      </w:r>
+      <w:r>
+        <w:rPr>
+          <w:color w:val="auto"/>
+        </w:rPr>
+        <w:t>。这种</w:t>
+      </w:r>
+      <w:r>
+        <w:rPr>
+          <w:rFonts w:hint="eastAsia"/>
+          <w:color w:val="auto"/>
+          <w:lang w:eastAsia="zh-CN"/>
+        </w:rPr>
+        <w:t>“</w:t>
+      </w:r>
+      <w:r>
+        <w:rPr>
+          <w:color w:val="auto"/>
+        </w:rPr>
+        <w:t>统一监管框架内进行职业内部分层</w:t>
+      </w:r>
+      <w:r>
+        <w:rPr>
+          <w:rFonts w:hint="eastAsia"/>
+          <w:color w:val="auto"/>
+          <w:lang w:eastAsia="zh-CN"/>
+        </w:rPr>
+        <w:t>”</w:t>
+      </w:r>
+      <w:r>
+        <w:rPr>
+          <w:color w:val="auto"/>
+        </w:rPr>
+        <w:t>的设计，既规避了美国式的州际碎片化，又较澳大利亚的扁平结构更精细地识别了执业者的能力梯度。</w:t>
+      </w:r>
+    </w:p>
+    <w:p>
+      <w:pPr>
+        <w:spacing w:after="80"/>
+        <w:rPr>
+          <w:color w:val="auto"/>
+        </w:rPr>
+      </w:pPr>
+    </w:p>
+    <w:p>
+      <w:pPr>
+        <w:pStyle w:val="2"/>
+        <w:rPr>
+          <w:color w:val="auto"/>
+        </w:rPr>
+      </w:pPr>
+      <w:r>
+        <w:rPr>
+          <w:color w:val="auto"/>
+        </w:rPr>
+        <w:t>8 结论</w:t>
       </w:r>
     </w:p>
     <w:p>
@@ -3476,21 +3654,29 @@
         <w:rPr>
           <w:color w:val="auto"/>
         </w:rPr>
-        <w:t>Doctor头衔制度的形成，反映出传统医学逐步融入现代医疗监管体系的制度趋势。透过法律监管、教育标准与能力评估制度之间的协调，中医职业得以在维持自身理论体系的同时，逐步建立符合现代医疗职业特征的专业结构。这一发展模式表明，传统医学的制度化过程并非单纯的职业分类调整，而是涉及教育体系、专业能力与医疗治理结构的整体转型。</w:t>
-      </w:r>
-    </w:p>
-    <w:p>
-      <w:pPr>
-        <w:pStyle w:val="3"/>
-        <w:rPr>
-          <w:color w:val="auto"/>
-        </w:rPr>
-      </w:pPr>
-      <w:r>
-        <w:rPr>
-          <w:color w:val="auto"/>
-        </w:rPr>
-        <w:t>8.1 理论总结</w:t>
+        <w:t>安大略省中医Doctor头衔制度的建立，标志着中医职业制度发展进入新的阶段</w:t>
+      </w:r>
+      <w:r>
+        <w:rPr>
+          <w:rFonts w:hint="eastAsia"/>
+          <w:color w:val="auto"/>
+          <w:lang w:eastAsia="zh-CN"/>
+        </w:rPr>
+        <w:t>，</w:t>
+      </w:r>
+      <w:r>
+        <w:rPr>
+          <w:rFonts w:hint="eastAsia"/>
+          <w:color w:val="auto"/>
+          <w:lang w:val="en-US" w:eastAsia="zh-CN"/>
+        </w:rPr>
+        <w:t>也</w:t>
+      </w:r>
+      <w:r>
+        <w:rPr>
+          <w:color w:val="auto"/>
+        </w:rPr>
+        <w:t>为传统医学职业监管提供了一种具有参考价值的制度模式。在既有监管框架下，通过能力标准、教育要求与临床评估制度之间的系统衔接，中医职业逐步形成具有层级结构的专业体系。Doctor头衔在此结构中承担识别高层级临床能力的制度功能，使职业内部的专业分工与能力差异得以在法律与监管层面获得明确表达。</w:t>
       </w:r>
     </w:p>
     <w:p>
@@ -3506,21 +3692,7 @@
         <w:rPr>
           <w:color w:val="auto"/>
         </w:rPr>
-        <w:t>本研究表明，安大略省中医Doctor头衔制度的形成遵循清晰的职业制度演进路径：标准化→能力分层→头衔制度→主流医疗体系整合。该路径揭示了传统医学职业制度化的内在逻辑——职业制度的成熟并非单一事件，而是教育体系规范化、专业能力标准化与制度认可机制相互强化的持续过程。Doctor头衔制度正是这一过程中的关键制度节点，标志着中医职业由执业许可管理向能力分层治理的制度转型。</w:t>
-      </w:r>
-    </w:p>
-    <w:p>
-      <w:pPr>
-        <w:pStyle w:val="3"/>
-        <w:rPr>
-          <w:color w:val="auto"/>
-        </w:rPr>
-      </w:pPr>
-      <w:r>
-        <w:rPr>
-          <w:color w:val="auto"/>
-        </w:rPr>
-        <w:t>8.2 对中国的启示</w:t>
+        <w:t>与既有R.TCMP与R.Ac注册资格相比，Doctor头衔所代表的不仅是执业范围的差异，更涉及临床决策能力与专业责任的制度定位。通过能力框架与资格评估制度的配套设计，Doctor头衔成为监管机构识别高层级临床执业者的重要制度工具——对患者有助于提高专业能力的可辨识性，对监管制度则有助于在职业分层与公共安全保障之间建立更清晰的制度联系。</w:t>
       </w:r>
     </w:p>
     <w:p>
@@ -3536,14 +3708,7 @@
         <w:rPr>
           <w:color w:val="auto"/>
         </w:rPr>
-        <w:t>安大略省的制度实践对中国推进中医职业制度改革具有重要参考价值。首先，中国现行中医职称制度（初级/中级/副高/正高）以职称序列为主轴，与基于能力分层的执业头衔制度在制度逻辑上存在差异——前者侧重科研贡献与年资积累，后者侧重临床能力认证。探索建立与职称制度相独立的能力分层执业头衔机制，或可作为中国中医职业制度改革的方向之一。其次，在国际化层面，国内职业资格体系与国际监管标准的兼容性将直接影响中医海外执业者的资历认可与职业发展路径，值得政策层面深入探讨。</w:t>
-      </w:r>
-      <w:r>
-        <w:rPr>
-          <w:rStyle w:val="16"/>
-          <w:color w:val="auto"/>
-        </w:rPr>
-        <w:footnoteReference w:id="13"/>
+        <w:t>Doctor头衔制度的形成，反映出传统医学逐步融入现代医疗监管体系的制度趋势。透过法律监管、教育标准与能力评估制度之间的协调，中医职业得以在维持自身理论体系的同时，逐步建立符合现代医疗职业特征的专业结构。这一发展模式表明，传统医学的制度化过程并非单纯的职业分类调整，而是涉及教育体系、专业能力与医疗治理结构的整体转型。</w:t>
       </w:r>
     </w:p>
     <w:p>
@@ -3557,8 +3722,10 @@
         <w:rPr>
           <w:color w:val="auto"/>
         </w:rPr>
-        <w:t>8.3 国际意义</w:t>
-      </w:r>
+        <w:t>8.1 理论总结</w:t>
+      </w:r>
+      <w:bookmarkStart w:id="0" w:name="_GoBack"/>
+      <w:bookmarkEnd w:id="0"/>
     </w:p>
     <w:p>
       <w:pPr>
@@ -3573,7 +3740,90 @@
         <w:rPr>
           <w:color w:val="auto"/>
         </w:rPr>
-        <w:t>从更宏观的国际视野看，安大略省Doctor头衔制度为全球传统医学职业监管提供了可借鉴的制度框架。安大略省通过RHPA框架整合传统医学职业头衔的路径，展示了传统医学在保持理论特色的同时融入西方法律监管体系的可行模式，对澳大利亚、英国、美国等正在完善中医监管制度的国家和地区亦具有制度参照意义。传统医学的制度化过程须以教育体系、能力框架与法律监管三者的有机协调为基础，而能力分层机制则是实现传统医学向主流医疗体系有序整合的关键制度杠杆。</w:t>
+        <w:t>本研究表明，安大略省中医Doctor头衔制度的形成遵循清晰的职业制度演进路径：标准化→能力分层→头衔制度→主流医疗体系整合。该路径揭示了传统医学职业制度化的内在逻辑——职业制度的成熟并非单一事件，而是教育体系规范化、专业能力标准化与制度认可机制相互强化的持续过程。Doctor头衔制度正是这一过程中的关键制度节点，标志着中医职业由执业许可管理向能力分层治理的制度转型。</w:t>
+      </w:r>
+    </w:p>
+    <w:p>
+      <w:pPr>
+        <w:pStyle w:val="3"/>
+        <w:rPr>
+          <w:color w:val="auto"/>
+        </w:rPr>
+      </w:pPr>
+      <w:r>
+        <w:rPr>
+          <w:color w:val="auto"/>
+        </w:rPr>
+        <w:t>8.2 对中国的启示</w:t>
+      </w:r>
+    </w:p>
+    <w:p>
+      <w:pPr>
+        <w:spacing w:after="140" w:line="380" w:lineRule="auto"/>
+        <w:ind w:firstLine="480"/>
+        <w:jc w:val="both"/>
+        <w:rPr>
+          <w:color w:val="auto"/>
+        </w:rPr>
+      </w:pPr>
+      <w:r>
+        <w:rPr>
+          <w:color w:val="auto"/>
+        </w:rPr>
+        <w:t>安大略省的制度实践对中国推进中医职业制度改革具有重要参考价值。首先，中国现行中医职称制度（初级/中级/副高/正高）以职称序列为主轴，与基于能力分层的执业头衔制度在制度逻辑上存在差异——前者侧重科研贡献与年资积累，后者侧重临床能力认证。探索建立与职称制度相独立的能力分层执业头衔机制，或可作为中国中医职业制度改革的方向之一。其次，在国际化层面，国内职业资格体系与国际监管标准的兼容性将直接影响中医海外执业者的资历认可与职业发展路径，值得政策层面深入探讨。</w:t>
+      </w:r>
+      <w:r>
+        <w:rPr>
+          <w:rStyle w:val="16"/>
+          <w:color w:val="auto"/>
+        </w:rPr>
+        <w:footnoteReference w:id="13"/>
+      </w:r>
+    </w:p>
+    <w:p>
+      <w:pPr>
+        <w:pStyle w:val="3"/>
+        <w:rPr>
+          <w:color w:val="auto"/>
+        </w:rPr>
+      </w:pPr>
+      <w:r>
+        <w:rPr>
+          <w:color w:val="auto"/>
+        </w:rPr>
+        <w:t>8.3 国际意义</w:t>
+      </w:r>
+    </w:p>
+    <w:p>
+      <w:pPr>
+        <w:spacing w:after="140" w:line="380" w:lineRule="auto"/>
+        <w:ind w:firstLine="480"/>
+        <w:jc w:val="both"/>
+        <w:rPr>
+          <w:color w:val="auto"/>
+        </w:rPr>
+      </w:pPr>
+      <w:r>
+        <w:rPr>
+          <w:color w:val="auto"/>
+        </w:rPr>
+        <w:t>从更宏观的国际视野看，安大略省Doctor头衔制度为全球传统医学职业监管提供了可借鉴的制度框架。安大略省通过RHPA框架整合传统医学职业头衔的路径，展示了传统医学在保持理论特色的同时融入西方法律监管体系的可行模式。在全球范围内，多数传统医学体系在制度化过程中面临类似问题，即如何在维持传统医学理论特色的同时，建立符合现代医疗监管要求的职业制度。安大略模式通过法律监管、能力框架与教育制度之间的有机衔接，为中医职业体系逐步形成现代医疗职业特征的监管结构提供了制度参照。</w:t>
+      </w:r>
+    </w:p>
+    <w:p>
+      <w:pPr>
+        <w:spacing w:after="140" w:line="380" w:lineRule="auto"/>
+        <w:ind w:firstLine="480"/>
+        <w:jc w:val="both"/>
+        <w:rPr>
+          <w:color w:val="auto"/>
+        </w:rPr>
+      </w:pPr>
+      <w:r>
+        <w:rPr>
+          <w:color w:val="auto"/>
+        </w:rPr>
+        <w:t>传统医学的制度化过程须以教育体系、能力框架与法律监管三者的有机协调为基础，而能力分层机制则是实现传统医学向主流医疗体系有序整合的关键制度杠杆。</w:t>
       </w:r>
     </w:p>
     <w:p>
@@ -3915,6 +4165,110 @@
           <w:szCs w:val="20"/>
         </w:rPr>
         <w:t>国家中医药管理局. 中医药发展战略规划纲要（2016—2030年） [Z]. 北京: 国家中医药管理局, 2016.</w:t>
+      </w:r>
+    </w:p>
+    <w:p>
+      <w:pPr>
+        <w:pStyle w:val="17"/>
+        <w:numPr>
+          <w:ilvl w:val="0"/>
+          <w:numId w:val="1"/>
+        </w:numPr>
+        <w:spacing w:after="80" w:line="320" w:lineRule="auto"/>
+        <w:jc w:val="both"/>
+        <w:rPr>
+          <w:rFonts w:eastAsia="PMingLiU"/>
+          <w:color w:val="auto"/>
+          <w:sz w:val="20"/>
+          <w:szCs w:val="20"/>
+        </w:rPr>
+      </w:pPr>
+      <w:r>
+        <w:rPr>
+          <w:rFonts w:eastAsia="PMingLiU"/>
+          <w:color w:val="auto"/>
+          <w:sz w:val="20"/>
+          <w:szCs w:val="20"/>
+        </w:rPr>
+        <w:t>STONE J A M. The status of acupuncture and oriental medicine in the United States [J]. Chinese Journal of Integrative Medicine, 2014, 20(4): 243-249. DOI: 10.1007/s11655-014-1776-0.</w:t>
+      </w:r>
+    </w:p>
+    <w:p>
+      <w:pPr>
+        <w:pStyle w:val="17"/>
+        <w:numPr>
+          <w:ilvl w:val="0"/>
+          <w:numId w:val="1"/>
+        </w:numPr>
+        <w:spacing w:after="80" w:line="320" w:lineRule="auto"/>
+        <w:jc w:val="both"/>
+        <w:rPr>
+          <w:rFonts w:eastAsia="PMingLiU"/>
+          <w:color w:val="auto"/>
+          <w:sz w:val="20"/>
+          <w:szCs w:val="20"/>
+        </w:rPr>
+      </w:pPr>
+      <w:r>
+        <w:rPr>
+          <w:rFonts w:eastAsia="PMingLiU"/>
+          <w:color w:val="auto"/>
+          <w:sz w:val="20"/>
+          <w:szCs w:val="20"/>
+        </w:rPr>
+        <w:t>FAN A Y, HE D G, SANGRAULA A, et al. Distribution of licensed acupuncturists and educational institutions in the United States at the start of 2023, during the late stage of the COVID-19 pandemic [J]. Journal of Integrative Medicine, 2024, 22(4): 379-384. DOI: 10.1016/j.joim.2024.06.002.</w:t>
+      </w:r>
+    </w:p>
+    <w:p>
+      <w:pPr>
+        <w:pStyle w:val="17"/>
+        <w:numPr>
+          <w:ilvl w:val="0"/>
+          <w:numId w:val="1"/>
+        </w:numPr>
+        <w:spacing w:after="80" w:line="320" w:lineRule="auto"/>
+        <w:jc w:val="both"/>
+        <w:rPr>
+          <w:rFonts w:eastAsia="PMingLiU"/>
+          <w:color w:val="auto"/>
+          <w:sz w:val="20"/>
+          <w:szCs w:val="20"/>
+        </w:rPr>
+      </w:pPr>
+      <w:r>
+        <w:rPr>
+          <w:rFonts w:eastAsia="PMingLiU"/>
+          <w:color w:val="auto"/>
+          <w:sz w:val="20"/>
+          <w:szCs w:val="20"/>
+        </w:rPr>
+        <w:t>BLECK R R, GOLD M A, WESTHOFF C L. Training hour requirements to provide acupuncture in the United States [J]. Acupuncture in Medicine, 2021, 39(4): 327-333. DOI: 10.1177/0964528420939576.</w:t>
+      </w:r>
+    </w:p>
+    <w:p>
+      <w:pPr>
+        <w:pStyle w:val="17"/>
+        <w:numPr>
+          <w:ilvl w:val="0"/>
+          <w:numId w:val="1"/>
+        </w:numPr>
+        <w:spacing w:after="80" w:line="320" w:lineRule="auto"/>
+        <w:jc w:val="both"/>
+        <w:rPr>
+          <w:rFonts w:eastAsia="PMingLiU"/>
+          <w:color w:val="auto"/>
+          <w:sz w:val="20"/>
+          <w:szCs w:val="20"/>
+        </w:rPr>
+      </w:pPr>
+      <w:r>
+        <w:rPr>
+          <w:rFonts w:eastAsia="PMingLiU"/>
+          <w:color w:val="auto"/>
+          <w:sz w:val="20"/>
+          <w:szCs w:val="20"/>
+        </w:rPr>
+        <w:t>IJAZ N, BOON H. Evaluating the international standards gap for the use of acupuncture needles by physiotherapists and chiropractors: A policy analysis [J]. PLOS ONE, 2019, 14(12): e0226601. DOI: 10.1371/journal.pone.0226601.</w:t>
       </w:r>
     </w:p>
     <w:p>
@@ -4755,7 +5109,7 @@
     <w:lsdException w:qFormat="1" w:unhideWhenUsed="0" w:uiPriority="0" w:semiHidden="0" w:name="Title"/>
     <w:lsdException w:unhideWhenUsed="0" w:uiPriority="0" w:semiHidden="0" w:name="Closing"/>
     <w:lsdException w:unhideWhenUsed="0" w:uiPriority="0" w:semiHidden="0" w:name="Signature"/>
-    <w:lsdException w:uiPriority="1" w:semiHidden="0" w:name="Default Paragraph Font"/>
+    <w:lsdException w:qFormat="1" w:uiPriority="1" w:semiHidden="0" w:name="Default Paragraph Font"/>
     <w:lsdException w:unhideWhenUsed="0" w:uiPriority="0" w:semiHidden="0" w:name="Body Text"/>
     <w:lsdException w:unhideWhenUsed="0" w:uiPriority="0" w:semiHidden="0" w:name="Body Text Indent"/>
     <w:lsdException w:unhideWhenUsed="0" w:uiPriority="0" w:semiHidden="0" w:name="List Continue"/>
@@ -4782,7 +5136,7 @@
     <w:lsdException w:unhideWhenUsed="0" w:uiPriority="0" w:semiHidden="0" w:name="Document Map"/>
     <w:lsdException w:unhideWhenUsed="0" w:uiPriority="0" w:semiHidden="0" w:name="Plain Text"/>
     <w:lsdException w:unhideWhenUsed="0" w:uiPriority="0" w:semiHidden="0" w:name="E-mail Signature"/>
-    <w:lsdException w:unhideWhenUsed="0" w:uiPriority="0" w:semiHidden="0" w:name="Normal (Web)"/>
+    <w:lsdException w:qFormat="1" w:unhideWhenUsed="0" w:uiPriority="0" w:semiHidden="0" w:name="Normal (Web)"/>
     <w:lsdException w:unhideWhenUsed="0" w:uiPriority="0" w:semiHidden="0" w:name="HTML Acronym"/>
     <w:lsdException w:unhideWhenUsed="0" w:uiPriority="0" w:semiHidden="0" w:name="HTML Address"/>
     <w:lsdException w:unhideWhenUsed="0" w:uiPriority="0" w:semiHidden="0" w:name="HTML Cite"/>
@@ -4793,7 +5147,7 @@
     <w:lsdException w:unhideWhenUsed="0" w:uiPriority="0" w:semiHidden="0" w:name="HTML Sample"/>
     <w:lsdException w:unhideWhenUsed="0" w:uiPriority="0" w:semiHidden="0" w:name="HTML Typewriter"/>
     <w:lsdException w:unhideWhenUsed="0" w:uiPriority="0" w:semiHidden="0" w:name="HTML Variable"/>
-    <w:lsdException w:uiPriority="99" w:name="Normal Table"/>
+    <w:lsdException w:qFormat="1" w:uiPriority="99" w:name="Normal Table"/>
     <w:lsdException w:unhideWhenUsed="0" w:uiPriority="0" w:semiHidden="0" w:name="annotation subject"/>
     <w:lsdException w:uiPriority="0" w:name="Table Simple 1"/>
     <w:lsdException w:uiPriority="0" w:name="Table Simple 2"/>
@@ -5068,12 +5422,14 @@
   <w:style w:type="character" w:default="1" w:styleId="13">
     <w:name w:val="Default Paragraph Font"/>
     <w:unhideWhenUsed/>
+    <w:qFormat/>
     <w:uiPriority w:val="1"/>
   </w:style>
   <w:style w:type="table" w:default="1" w:styleId="12">
     <w:name w:val="Normal Table"/>
     <w:semiHidden/>
     <w:unhideWhenUsed/>
+    <w:qFormat/>
     <w:uiPriority w:val="99"/>
     <w:tblPr>
       <w:tblCellMar>
@@ -5111,6 +5467,7 @@
   <w:style w:type="paragraph" w:styleId="10">
     <w:name w:val="Normal (Web)"/>
     <w:basedOn w:val="1"/>
+    <w:qFormat/>
     <w:uiPriority w:val="0"/>
     <w:rPr>
       <w:sz w:val="24"/>

</xml_diff>